<commit_message>
AGREGANDO LOS SPRINT AL REPOSITORIO
</commit_message>
<xml_diff>
--- a/Sprint_3.docx
+++ b/Sprint_3.docx
@@ -178,7 +178,7 @@
           </w:tcPr>
           <w:p>
             <w:r>
-              <w:t>Equipo del proyecto (editar nombres de integrantes)</w:t>
+              <w:t>Alexander Rodriguez – Elisa Hurtado</w:t>
             </w:r>
           </w:p>
         </w:tc>
@@ -289,7 +289,23 @@
         <w:spacing w:after="120" w:line="259" w:lineRule="auto"/>
       </w:pPr>
       <w:r>
-        <w:t>Implementar el registro de control de calidad, las etapas básicas de poscosecha y la consulta de trazabilidad por código de lote.</w:t>
+        <w:t xml:space="preserve">Implementar el </w:t>
+      </w:r>
+      <w:proofErr w:type="spellStart"/>
+      <w:r>
+        <w:t>registro</w:t>
+      </w:r>
+      <w:proofErr w:type="spellEnd"/>
+      <w:r>
+        <w:t xml:space="preserve"> de control de calidad, las </w:t>
+      </w:r>
+      <w:proofErr w:type="spellStart"/>
+      <w:r>
+        <w:t>etapas</w:t>
+      </w:r>
+      <w:proofErr w:type="spellEnd"/>
+      <w:r>
+        <w:t xml:space="preserve"> básicas de poscosecha y la consulta de trazabilidad por código de lote.</w:t>
       </w:r>
     </w:p>
     <w:tbl>
@@ -490,7 +506,15 @@
         <w:ind w:left="360" w:hanging="216"/>
       </w:pPr>
       <w:r>
-        <w:t>• Registrar humedad del lote.</w:t>
+        <w:t xml:space="preserve">• Registrar </w:t>
+      </w:r>
+      <w:proofErr w:type="spellStart"/>
+      <w:r>
+        <w:t>humedad</w:t>
+      </w:r>
+      <w:proofErr w:type="spellEnd"/>
+      <w:r>
+        <w:t xml:space="preserve"> del lote.</w:t>
       </w:r>
     </w:p>
     <w:p>
@@ -498,7 +522,23 @@
         <w:ind w:left="360" w:hanging="216"/>
       </w:pPr>
       <w:r>
-        <w:t>• Registrar estado del grano, clasificación y observaciones.</w:t>
+        <w:t xml:space="preserve">• Registrar estado del grano, </w:t>
+      </w:r>
+      <w:proofErr w:type="spellStart"/>
+      <w:r>
+        <w:t>clasificación</w:t>
+      </w:r>
+      <w:proofErr w:type="spellEnd"/>
+      <w:r>
+        <w:t xml:space="preserve"> y </w:t>
+      </w:r>
+      <w:proofErr w:type="spellStart"/>
+      <w:r>
+        <w:t>observaciones</w:t>
+      </w:r>
+      <w:proofErr w:type="spellEnd"/>
+      <w:r>
+        <w:t>.</w:t>
       </w:r>
     </w:p>
     <w:p>
@@ -506,7 +546,47 @@
         <w:ind w:left="360" w:hanging="216"/>
       </w:pPr>
       <w:r>
-        <w:t>• Validar que la humedad sea un valor numérico dentro del rango definido.</w:t>
+        <w:t xml:space="preserve">• Validar que la </w:t>
+      </w:r>
+      <w:proofErr w:type="spellStart"/>
+      <w:r>
+        <w:t>humedad</w:t>
+      </w:r>
+      <w:proofErr w:type="spellEnd"/>
+      <w:r>
+        <w:t xml:space="preserve"> sea un valor </w:t>
+      </w:r>
+      <w:proofErr w:type="spellStart"/>
+      <w:r>
+        <w:t>numérico</w:t>
+      </w:r>
+      <w:proofErr w:type="spellEnd"/>
+      <w:r>
+        <w:t xml:space="preserve"> </w:t>
+      </w:r>
+      <w:proofErr w:type="spellStart"/>
+      <w:r>
+        <w:t>dentro</w:t>
+      </w:r>
+      <w:proofErr w:type="spellEnd"/>
+      <w:r>
+        <w:t xml:space="preserve"> del </w:t>
+      </w:r>
+      <w:proofErr w:type="spellStart"/>
+      <w:r>
+        <w:t>rango</w:t>
+      </w:r>
+      <w:proofErr w:type="spellEnd"/>
+      <w:r>
+        <w:t xml:space="preserve"> </w:t>
+      </w:r>
+      <w:proofErr w:type="spellStart"/>
+      <w:r>
+        <w:t>definido</w:t>
+      </w:r>
+      <w:proofErr w:type="spellEnd"/>
+      <w:r>
+        <w:t>.</w:t>
       </w:r>
     </w:p>
     <w:p>
@@ -514,7 +594,31 @@
         <w:ind w:left="360" w:hanging="216"/>
       </w:pPr>
       <w:r>
-        <w:t>• Actualizar el estado del lote según la calidad registrada.</w:t>
+        <w:t xml:space="preserve">• </w:t>
+      </w:r>
+      <w:proofErr w:type="spellStart"/>
+      <w:r>
+        <w:t>Actualizar</w:t>
+      </w:r>
+      <w:proofErr w:type="spellEnd"/>
+      <w:r>
+        <w:t xml:space="preserve"> el estado del lote </w:t>
+      </w:r>
+      <w:proofErr w:type="spellStart"/>
+      <w:r>
+        <w:t>según</w:t>
+      </w:r>
+      <w:proofErr w:type="spellEnd"/>
+      <w:r>
+        <w:t xml:space="preserve"> la calidad </w:t>
+      </w:r>
+      <w:proofErr w:type="spellStart"/>
+      <w:r>
+        <w:t>registrada</w:t>
+      </w:r>
+      <w:proofErr w:type="spellEnd"/>
+      <w:r>
+        <w:t>.</w:t>
       </w:r>
     </w:p>
     <w:p>
@@ -522,7 +626,31 @@
         <w:ind w:left="360" w:hanging="216"/>
       </w:pPr>
       <w:r>
-        <w:t>• Registrar etapas de fermentación, secado y estado del lote.</w:t>
+        <w:t xml:space="preserve">• Registrar </w:t>
+      </w:r>
+      <w:proofErr w:type="spellStart"/>
+      <w:r>
+        <w:t>etapas</w:t>
+      </w:r>
+      <w:proofErr w:type="spellEnd"/>
+      <w:r>
+        <w:t xml:space="preserve"> de </w:t>
+      </w:r>
+      <w:proofErr w:type="spellStart"/>
+      <w:r>
+        <w:t>fermentación</w:t>
+      </w:r>
+      <w:proofErr w:type="spellEnd"/>
+      <w:r>
+        <w:t xml:space="preserve">, </w:t>
+      </w:r>
+      <w:proofErr w:type="spellStart"/>
+      <w:r>
+        <w:t>secado</w:t>
+      </w:r>
+      <w:proofErr w:type="spellEnd"/>
+      <w:r>
+        <w:t xml:space="preserve"> y estado del lote.</w:t>
       </w:r>
     </w:p>
     <w:p>
@@ -530,7 +658,31 @@
         <w:ind w:left="360" w:hanging="216"/>
       </w:pPr>
       <w:r>
-        <w:t>• Consultar trazabilidad básica mediante código de lote.</w:t>
+        <w:t xml:space="preserve">• </w:t>
+      </w:r>
+      <w:proofErr w:type="spellStart"/>
+      <w:r>
+        <w:t>Consultar</w:t>
+      </w:r>
+      <w:proofErr w:type="spellEnd"/>
+      <w:r>
+        <w:t xml:space="preserve"> trazabilidad </w:t>
+      </w:r>
+      <w:proofErr w:type="spellStart"/>
+      <w:r>
+        <w:t>básica</w:t>
+      </w:r>
+      <w:proofErr w:type="spellEnd"/>
+      <w:r>
+        <w:t xml:space="preserve"> </w:t>
+      </w:r>
+      <w:proofErr w:type="spellStart"/>
+      <w:r>
+        <w:t>mediante</w:t>
+      </w:r>
+      <w:proofErr w:type="spellEnd"/>
+      <w:r>
+        <w:t xml:space="preserve"> código de lote.</w:t>
       </w:r>
     </w:p>
     <w:p>
@@ -538,7 +690,31 @@
         <w:ind w:left="360" w:hanging="216"/>
       </w:pPr>
       <w:r>
-        <w:t>• Mostrar mensaje claro cuando el lote no exista.</w:t>
+        <w:t xml:space="preserve">• Mostrar </w:t>
+      </w:r>
+      <w:proofErr w:type="spellStart"/>
+      <w:r>
+        <w:t>mensaje</w:t>
+      </w:r>
+      <w:proofErr w:type="spellEnd"/>
+      <w:r>
+        <w:t xml:space="preserve"> claro </w:t>
+      </w:r>
+      <w:proofErr w:type="spellStart"/>
+      <w:r>
+        <w:t>cuando</w:t>
+      </w:r>
+      <w:proofErr w:type="spellEnd"/>
+      <w:r>
+        <w:t xml:space="preserve"> el lote no </w:t>
+      </w:r>
+      <w:proofErr w:type="spellStart"/>
+      <w:r>
+        <w:t>exista</w:t>
+      </w:r>
+      <w:proofErr w:type="spellEnd"/>
+      <w:r>
+        <w:t>.</w:t>
       </w:r>
     </w:p>
     <w:p>
@@ -634,7 +810,49 @@
               <w:rPr>
                 <w:sz w:val="17"/>
               </w:rPr>
-              <w:t>El sistema debe permitir registrar control de calidad: humedad, estado, clasificación y observaciones.</w:t>
+              <w:t xml:space="preserve">El sistema debe permitir registrar control de calidad: </w:t>
+            </w:r>
+            <w:proofErr w:type="spellStart"/>
+            <w:r>
+              <w:rPr>
+                <w:sz w:val="17"/>
+              </w:rPr>
+              <w:t>humedad</w:t>
+            </w:r>
+            <w:proofErr w:type="spellEnd"/>
+            <w:r>
+              <w:rPr>
+                <w:sz w:val="17"/>
+              </w:rPr>
+              <w:t xml:space="preserve">, estado, </w:t>
+            </w:r>
+            <w:proofErr w:type="spellStart"/>
+            <w:r>
+              <w:rPr>
+                <w:sz w:val="17"/>
+              </w:rPr>
+              <w:t>clasificación</w:t>
+            </w:r>
+            <w:proofErr w:type="spellEnd"/>
+            <w:r>
+              <w:rPr>
+                <w:sz w:val="17"/>
+              </w:rPr>
+              <w:t xml:space="preserve"> y </w:t>
+            </w:r>
+            <w:proofErr w:type="spellStart"/>
+            <w:r>
+              <w:rPr>
+                <w:sz w:val="17"/>
+              </w:rPr>
+              <w:t>observaciones</w:t>
+            </w:r>
+            <w:proofErr w:type="spellEnd"/>
+            <w:r>
+              <w:rPr>
+                <w:sz w:val="17"/>
+              </w:rPr>
+              <w:t>.</w:t>
             </w:r>
           </w:p>
         </w:tc>
@@ -665,7 +883,49 @@
               <w:rPr>
                 <w:sz w:val="17"/>
               </w:rPr>
-              <w:t>El sistema debe permitir registrar etapas de poscosecha: fermentación, secado y estado del lote.</w:t>
+              <w:t xml:space="preserve">El sistema debe permitir registrar </w:t>
+            </w:r>
+            <w:proofErr w:type="spellStart"/>
+            <w:r>
+              <w:rPr>
+                <w:sz w:val="17"/>
+              </w:rPr>
+              <w:t>etapas</w:t>
+            </w:r>
+            <w:proofErr w:type="spellEnd"/>
+            <w:r>
+              <w:rPr>
+                <w:sz w:val="17"/>
+              </w:rPr>
+              <w:t xml:space="preserve"> de poscosecha: </w:t>
+            </w:r>
+            <w:proofErr w:type="spellStart"/>
+            <w:r>
+              <w:rPr>
+                <w:sz w:val="17"/>
+              </w:rPr>
+              <w:t>fermentación</w:t>
+            </w:r>
+            <w:proofErr w:type="spellEnd"/>
+            <w:r>
+              <w:rPr>
+                <w:sz w:val="17"/>
+              </w:rPr>
+              <w:t xml:space="preserve">, </w:t>
+            </w:r>
+            <w:proofErr w:type="spellStart"/>
+            <w:r>
+              <w:rPr>
+                <w:sz w:val="17"/>
+              </w:rPr>
+              <w:t>secado</w:t>
+            </w:r>
+            <w:proofErr w:type="spellEnd"/>
+            <w:r>
+              <w:rPr>
+                <w:sz w:val="17"/>
+              </w:rPr>
+              <w:t xml:space="preserve"> y estado del lote.</w:t>
             </w:r>
           </w:p>
         </w:tc>
@@ -696,7 +956,35 @@
               <w:rPr>
                 <w:sz w:val="17"/>
               </w:rPr>
-              <w:t>El sistema debe permitir buscar un lote por su código.</w:t>
+              <w:t xml:space="preserve">El sistema debe permitir </w:t>
+            </w:r>
+            <w:proofErr w:type="spellStart"/>
+            <w:r>
+              <w:rPr>
+                <w:sz w:val="17"/>
+              </w:rPr>
+              <w:t>buscar</w:t>
+            </w:r>
+            <w:proofErr w:type="spellEnd"/>
+            <w:r>
+              <w:rPr>
+                <w:sz w:val="17"/>
+              </w:rPr>
+              <w:t xml:space="preserve"> un lote por </w:t>
+            </w:r>
+            <w:proofErr w:type="spellStart"/>
+            <w:r>
+              <w:rPr>
+                <w:sz w:val="17"/>
+              </w:rPr>
+              <w:t>su</w:t>
+            </w:r>
+            <w:proofErr w:type="spellEnd"/>
+            <w:r>
+              <w:rPr>
+                <w:sz w:val="17"/>
+              </w:rPr>
+              <w:t xml:space="preserve"> código.</w:t>
             </w:r>
           </w:p>
         </w:tc>
@@ -907,13 +1195,22 @@
         <w:tc>
           <w:tcPr>
             <w:tcW w:w="2880" w:type="dxa"/>
-          </w:tcPr>
-          <w:p>
-            <w:r>
-              <w:rPr>
-                <w:sz w:val="15"/>
-              </w:rPr>
-              <w:t>Editar nombre</w:t>
+            <w:vAlign w:val="center"/>
+          </w:tcPr>
+          <w:p>
+            <w:r>
+              <w:rPr>
+                <w:sz w:val="14"/>
+                <w:szCs w:val="14"/>
+              </w:rPr>
+              <w:t>Elisa</w:t>
+            </w:r>
+            <w:r>
+              <w:rPr>
+                <w:sz w:val="14"/>
+                <w:szCs w:val="14"/>
+              </w:rPr>
+              <w:t xml:space="preserve"> Hurtado</w:t>
             </w:r>
           </w:p>
         </w:tc>
@@ -951,13 +1248,15 @@
         <w:tc>
           <w:tcPr>
             <w:tcW w:w="2880" w:type="dxa"/>
-          </w:tcPr>
-          <w:p>
-            <w:r>
-              <w:rPr>
-                <w:sz w:val="15"/>
-              </w:rPr>
-              <w:t>Editar nombre</w:t>
+            <w:vAlign w:val="center"/>
+          </w:tcPr>
+          <w:p>
+            <w:r>
+              <w:rPr>
+                <w:sz w:val="14"/>
+                <w:szCs w:val="14"/>
+              </w:rPr>
+              <w:t>Alexander Rodriguez</w:t>
             </w:r>
           </w:p>
         </w:tc>
@@ -995,13 +1294,15 @@
         <w:tc>
           <w:tcPr>
             <w:tcW w:w="2880" w:type="dxa"/>
-          </w:tcPr>
-          <w:p>
-            <w:r>
-              <w:rPr>
-                <w:sz w:val="15"/>
-              </w:rPr>
-              <w:t>Equipo del proyecto</w:t>
+            <w:vAlign w:val="center"/>
+          </w:tcPr>
+          <w:p>
+            <w:r>
+              <w:rPr>
+                <w:sz w:val="14"/>
+                <w:szCs w:val="14"/>
+              </w:rPr>
+              <w:t>Elisa, Alexander</w:t>
             </w:r>
           </w:p>
         </w:tc>
@@ -1039,13 +1340,15 @@
         <w:tc>
           <w:tcPr>
             <w:tcW w:w="2880" w:type="dxa"/>
-          </w:tcPr>
-          <w:p>
-            <w:r>
-              <w:rPr>
-                <w:sz w:val="15"/>
-              </w:rPr>
-              <w:t>Editar nombre</w:t>
+            <w:vAlign w:val="center"/>
+          </w:tcPr>
+          <w:p>
+            <w:r>
+              <w:rPr>
+                <w:sz w:val="14"/>
+                <w:szCs w:val="14"/>
+              </w:rPr>
+              <w:t>Alexander Rodriguez</w:t>
             </w:r>
           </w:p>
         </w:tc>
@@ -1083,13 +1386,15 @@
         <w:tc>
           <w:tcPr>
             <w:tcW w:w="2880" w:type="dxa"/>
-          </w:tcPr>
-          <w:p>
-            <w:r>
-              <w:rPr>
-                <w:sz w:val="15"/>
-              </w:rPr>
-              <w:t>Editar nombre</w:t>
+            <w:vAlign w:val="center"/>
+          </w:tcPr>
+          <w:p>
+            <w:r>
+              <w:rPr>
+                <w:sz w:val="14"/>
+                <w:szCs w:val="14"/>
+              </w:rPr>
+              <w:t>Alexander Rodriguez</w:t>
             </w:r>
           </w:p>
         </w:tc>
@@ -1127,13 +1432,15 @@
         <w:tc>
           <w:tcPr>
             <w:tcW w:w="2880" w:type="dxa"/>
-          </w:tcPr>
-          <w:p>
-            <w:r>
-              <w:rPr>
-                <w:sz w:val="15"/>
-              </w:rPr>
-              <w:t>Editar nombre</w:t>
+            <w:vAlign w:val="center"/>
+          </w:tcPr>
+          <w:p>
+            <w:r>
+              <w:rPr>
+                <w:sz w:val="14"/>
+                <w:szCs w:val="14"/>
+              </w:rPr>
+              <w:t>Elisa Hurtado</w:t>
             </w:r>
           </w:p>
         </w:tc>
@@ -1171,13 +1478,15 @@
         <w:tc>
           <w:tcPr>
             <w:tcW w:w="2880" w:type="dxa"/>
-          </w:tcPr>
-          <w:p>
-            <w:r>
-              <w:rPr>
-                <w:sz w:val="15"/>
-              </w:rPr>
-              <w:t>Editar nombre</w:t>
+            <w:vAlign w:val="center"/>
+          </w:tcPr>
+          <w:p>
+            <w:r>
+              <w:rPr>
+                <w:sz w:val="14"/>
+                <w:szCs w:val="14"/>
+              </w:rPr>
+              <w:t>Alexander Rodriguez</w:t>
             </w:r>
           </w:p>
         </w:tc>
@@ -1215,13 +1524,15 @@
         <w:tc>
           <w:tcPr>
             <w:tcW w:w="2880" w:type="dxa"/>
-          </w:tcPr>
-          <w:p>
-            <w:r>
-              <w:rPr>
-                <w:sz w:val="15"/>
-              </w:rPr>
-              <w:t>Editar nombre</w:t>
+            <w:vAlign w:val="center"/>
+          </w:tcPr>
+          <w:p>
+            <w:r>
+              <w:rPr>
+                <w:sz w:val="14"/>
+                <w:szCs w:val="14"/>
+              </w:rPr>
+              <w:t>Elisa Hurtado</w:t>
             </w:r>
           </w:p>
         </w:tc>
@@ -1259,13 +1570,15 @@
         <w:tc>
           <w:tcPr>
             <w:tcW w:w="2880" w:type="dxa"/>
-          </w:tcPr>
-          <w:p>
-            <w:r>
-              <w:rPr>
-                <w:sz w:val="15"/>
-              </w:rPr>
-              <w:t>Editar nombre</w:t>
+            <w:vAlign w:val="center"/>
+          </w:tcPr>
+          <w:p>
+            <w:r>
+              <w:rPr>
+                <w:sz w:val="14"/>
+                <w:szCs w:val="14"/>
+              </w:rPr>
+              <w:t>Elisa, Alexander</w:t>
             </w:r>
           </w:p>
         </w:tc>
@@ -1304,13 +1617,15 @@
         <w:tc>
           <w:tcPr>
             <w:tcW w:w="2880" w:type="dxa"/>
-          </w:tcPr>
-          <w:p>
-            <w:r>
-              <w:rPr>
-                <w:sz w:val="15"/>
-              </w:rPr>
-              <w:t>Editar nombres</w:t>
+            <w:vAlign w:val="center"/>
+          </w:tcPr>
+          <w:p>
+            <w:r>
+              <w:rPr>
+                <w:sz w:val="14"/>
+                <w:szCs w:val="14"/>
+              </w:rPr>
+              <w:t>Alexander Rodriguez</w:t>
             </w:r>
           </w:p>
         </w:tc>
@@ -1348,13 +1663,15 @@
         <w:tc>
           <w:tcPr>
             <w:tcW w:w="2880" w:type="dxa"/>
-          </w:tcPr>
-          <w:p>
-            <w:r>
-              <w:rPr>
-                <w:sz w:val="15"/>
-              </w:rPr>
-              <w:t>Editar nombres</w:t>
+            <w:vAlign w:val="center"/>
+          </w:tcPr>
+          <w:p>
+            <w:r>
+              <w:rPr>
+                <w:sz w:val="14"/>
+                <w:szCs w:val="14"/>
+              </w:rPr>
+              <w:t>Elisa Hurtado</w:t>
             </w:r>
           </w:p>
         </w:tc>
@@ -1514,11 +1831,19 @@
             <w:tcW w:w="2448" w:type="dxa"/>
           </w:tcPr>
           <w:p>
-            <w:r>
-              <w:rPr>
-                <w:sz w:val="14"/>
-              </w:rPr>
-              <w:t>Encargado de calidad</w:t>
+            <w:proofErr w:type="spellStart"/>
+            <w:r>
+              <w:rPr>
+                <w:sz w:val="14"/>
+              </w:rPr>
+              <w:t>Encargado</w:t>
+            </w:r>
+            <w:proofErr w:type="spellEnd"/>
+            <w:r>
+              <w:rPr>
+                <w:sz w:val="14"/>
+              </w:rPr>
+              <w:t xml:space="preserve"> de calidad</w:t>
             </w:r>
           </w:p>
         </w:tc>
@@ -1531,8 +1856,30 @@
               <w:rPr>
                 <w:sz w:val="14"/>
               </w:rPr>
-              <w:t>registrar humedad y clasificación</w:t>
-            </w:r>
+              <w:t xml:space="preserve">registrar </w:t>
+            </w:r>
+            <w:proofErr w:type="spellStart"/>
+            <w:r>
+              <w:rPr>
+                <w:sz w:val="14"/>
+              </w:rPr>
+              <w:t>humedad</w:t>
+            </w:r>
+            <w:proofErr w:type="spellEnd"/>
+            <w:r>
+              <w:rPr>
+                <w:sz w:val="14"/>
+              </w:rPr>
+              <w:t xml:space="preserve"> y </w:t>
+            </w:r>
+            <w:proofErr w:type="spellStart"/>
+            <w:r>
+              <w:rPr>
+                <w:sz w:val="14"/>
+              </w:rPr>
+              <w:t>clasificación</w:t>
+            </w:r>
+            <w:proofErr w:type="spellEnd"/>
           </w:p>
         </w:tc>
         <w:tc>
@@ -1540,11 +1887,19 @@
             <w:tcW w:w="3168" w:type="dxa"/>
           </w:tcPr>
           <w:p>
-            <w:r>
-              <w:rPr>
-                <w:sz w:val="14"/>
-              </w:rPr>
-              <w:t>controlar la calidad del lote</w:t>
+            <w:proofErr w:type="spellStart"/>
+            <w:r>
+              <w:rPr>
+                <w:sz w:val="14"/>
+              </w:rPr>
+              <w:t>controlar</w:t>
+            </w:r>
+            <w:proofErr w:type="spellEnd"/>
+            <w:r>
+              <w:rPr>
+                <w:sz w:val="14"/>
+              </w:rPr>
+              <w:t xml:space="preserve"> la calidad del lote</w:t>
             </w:r>
           </w:p>
         </w:tc>
@@ -1557,7 +1912,91 @@
               <w:rPr>
                 <w:sz w:val="14"/>
               </w:rPr>
-              <w:t>Permite ingresar humedad, estado, clasificación y observaciones; valida rangos; actualiza estado del lote.</w:t>
+              <w:t xml:space="preserve">Permite </w:t>
+            </w:r>
+            <w:proofErr w:type="spellStart"/>
+            <w:r>
+              <w:rPr>
+                <w:sz w:val="14"/>
+              </w:rPr>
+              <w:t>ingresar</w:t>
+            </w:r>
+            <w:proofErr w:type="spellEnd"/>
+            <w:r>
+              <w:rPr>
+                <w:sz w:val="14"/>
+              </w:rPr>
+              <w:t xml:space="preserve"> </w:t>
+            </w:r>
+            <w:proofErr w:type="spellStart"/>
+            <w:r>
+              <w:rPr>
+                <w:sz w:val="14"/>
+              </w:rPr>
+              <w:t>humedad</w:t>
+            </w:r>
+            <w:proofErr w:type="spellEnd"/>
+            <w:r>
+              <w:rPr>
+                <w:sz w:val="14"/>
+              </w:rPr>
+              <w:t xml:space="preserve">, estado, </w:t>
+            </w:r>
+            <w:proofErr w:type="spellStart"/>
+            <w:r>
+              <w:rPr>
+                <w:sz w:val="14"/>
+              </w:rPr>
+              <w:t>clasificación</w:t>
+            </w:r>
+            <w:proofErr w:type="spellEnd"/>
+            <w:r>
+              <w:rPr>
+                <w:sz w:val="14"/>
+              </w:rPr>
+              <w:t xml:space="preserve"> y </w:t>
+            </w:r>
+            <w:proofErr w:type="spellStart"/>
+            <w:r>
+              <w:rPr>
+                <w:sz w:val="14"/>
+              </w:rPr>
+              <w:t>observaciones</w:t>
+            </w:r>
+            <w:proofErr w:type="spellEnd"/>
+            <w:r>
+              <w:rPr>
+                <w:sz w:val="14"/>
+              </w:rPr>
+              <w:t xml:space="preserve">; valida </w:t>
+            </w:r>
+            <w:proofErr w:type="spellStart"/>
+            <w:r>
+              <w:rPr>
+                <w:sz w:val="14"/>
+              </w:rPr>
+              <w:t>rangos</w:t>
+            </w:r>
+            <w:proofErr w:type="spellEnd"/>
+            <w:r>
+              <w:rPr>
+                <w:sz w:val="14"/>
+              </w:rPr>
+              <w:t xml:space="preserve">; </w:t>
+            </w:r>
+            <w:proofErr w:type="spellStart"/>
+            <w:r>
+              <w:rPr>
+                <w:sz w:val="14"/>
+              </w:rPr>
+              <w:t>actualiza</w:t>
+            </w:r>
+            <w:proofErr w:type="spellEnd"/>
+            <w:r>
+              <w:rPr>
+                <w:sz w:val="14"/>
+              </w:rPr>
+              <w:t xml:space="preserve"> estado del lote.</w:t>
             </w:r>
           </w:p>
         </w:tc>
@@ -1584,11 +2023,19 @@
             <w:tcW w:w="2448" w:type="dxa"/>
           </w:tcPr>
           <w:p>
-            <w:r>
-              <w:rPr>
-                <w:sz w:val="14"/>
-              </w:rPr>
-              <w:t>Encargado de calidad</w:t>
+            <w:proofErr w:type="spellStart"/>
+            <w:r>
+              <w:rPr>
+                <w:sz w:val="14"/>
+              </w:rPr>
+              <w:t>Encargado</w:t>
+            </w:r>
+            <w:proofErr w:type="spellEnd"/>
+            <w:r>
+              <w:rPr>
+                <w:sz w:val="14"/>
+              </w:rPr>
+              <w:t xml:space="preserve"> de calidad</w:t>
             </w:r>
           </w:p>
         </w:tc>
@@ -1610,11 +2057,75 @@
             <w:tcW w:w="3168" w:type="dxa"/>
           </w:tcPr>
           <w:p>
-            <w:r>
-              <w:rPr>
-                <w:sz w:val="14"/>
-              </w:rPr>
-              <w:t>conocer si el lote está en fermentación, secado o terminado</w:t>
+            <w:proofErr w:type="spellStart"/>
+            <w:r>
+              <w:rPr>
+                <w:sz w:val="14"/>
+              </w:rPr>
+              <w:t>conocer</w:t>
+            </w:r>
+            <w:proofErr w:type="spellEnd"/>
+            <w:r>
+              <w:rPr>
+                <w:sz w:val="14"/>
+              </w:rPr>
+              <w:t xml:space="preserve"> </w:t>
+            </w:r>
+            <w:proofErr w:type="spellStart"/>
+            <w:r>
+              <w:rPr>
+                <w:sz w:val="14"/>
+              </w:rPr>
+              <w:t>si</w:t>
+            </w:r>
+            <w:proofErr w:type="spellEnd"/>
+            <w:r>
+              <w:rPr>
+                <w:sz w:val="14"/>
+              </w:rPr>
+              <w:t xml:space="preserve"> el lote </w:t>
+            </w:r>
+            <w:proofErr w:type="spellStart"/>
+            <w:r>
+              <w:rPr>
+                <w:sz w:val="14"/>
+              </w:rPr>
+              <w:t>está</w:t>
+            </w:r>
+            <w:proofErr w:type="spellEnd"/>
+            <w:r>
+              <w:rPr>
+                <w:sz w:val="14"/>
+              </w:rPr>
+              <w:t xml:space="preserve"> en </w:t>
+            </w:r>
+            <w:proofErr w:type="spellStart"/>
+            <w:r>
+              <w:rPr>
+                <w:sz w:val="14"/>
+              </w:rPr>
+              <w:t>fermentación</w:t>
+            </w:r>
+            <w:proofErr w:type="spellEnd"/>
+            <w:r>
+              <w:rPr>
+                <w:sz w:val="14"/>
+              </w:rPr>
+              <w:t xml:space="preserve">, </w:t>
+            </w:r>
+            <w:proofErr w:type="spellStart"/>
+            <w:r>
+              <w:rPr>
+                <w:sz w:val="14"/>
+              </w:rPr>
+              <w:t>secado</w:t>
+            </w:r>
+            <w:proofErr w:type="spellEnd"/>
+            <w:r>
+              <w:rPr>
+                <w:sz w:val="14"/>
+              </w:rPr>
+              <w:t xml:space="preserve"> o terminado</w:t>
             </w:r>
           </w:p>
         </w:tc>
@@ -1627,7 +2138,77 @@
               <w:rPr>
                 <w:sz w:val="14"/>
               </w:rPr>
-              <w:t>Permite registrar etapa, fecha, estado y observaciones; conserva historial básico.</w:t>
+              <w:t xml:space="preserve">Permite registrar </w:t>
+            </w:r>
+            <w:proofErr w:type="spellStart"/>
+            <w:r>
+              <w:rPr>
+                <w:sz w:val="14"/>
+              </w:rPr>
+              <w:t>etapa</w:t>
+            </w:r>
+            <w:proofErr w:type="spellEnd"/>
+            <w:r>
+              <w:rPr>
+                <w:sz w:val="14"/>
+              </w:rPr>
+              <w:t xml:space="preserve">, fecha, estado y </w:t>
+            </w:r>
+            <w:proofErr w:type="spellStart"/>
+            <w:r>
+              <w:rPr>
+                <w:sz w:val="14"/>
+              </w:rPr>
+              <w:t>observaciones</w:t>
+            </w:r>
+            <w:proofErr w:type="spellEnd"/>
+            <w:r>
+              <w:rPr>
+                <w:sz w:val="14"/>
+              </w:rPr>
+              <w:t xml:space="preserve">; </w:t>
+            </w:r>
+            <w:proofErr w:type="spellStart"/>
+            <w:r>
+              <w:rPr>
+                <w:sz w:val="14"/>
+              </w:rPr>
+              <w:t>conserva</w:t>
+            </w:r>
+            <w:proofErr w:type="spellEnd"/>
+            <w:r>
+              <w:rPr>
+                <w:sz w:val="14"/>
+              </w:rPr>
+              <w:t xml:space="preserve"> </w:t>
+            </w:r>
+            <w:proofErr w:type="spellStart"/>
+            <w:r>
+              <w:rPr>
+                <w:sz w:val="14"/>
+              </w:rPr>
+              <w:t>historial</w:t>
+            </w:r>
+            <w:proofErr w:type="spellEnd"/>
+            <w:r>
+              <w:rPr>
+                <w:sz w:val="14"/>
+              </w:rPr>
+              <w:t xml:space="preserve"> </w:t>
+            </w:r>
+            <w:proofErr w:type="spellStart"/>
+            <w:r>
+              <w:rPr>
+                <w:sz w:val="14"/>
+              </w:rPr>
+              <w:t>básico</w:t>
+            </w:r>
+            <w:proofErr w:type="spellEnd"/>
+            <w:r>
+              <w:rPr>
+                <w:sz w:val="14"/>
+              </w:rPr>
+              <w:t>.</w:t>
             </w:r>
           </w:p>
         </w:tc>
@@ -1658,8 +2239,16 @@
               <w:rPr>
                 <w:sz w:val="14"/>
               </w:rPr>
-              <w:t>Usuario autorizado</w:t>
-            </w:r>
+              <w:t xml:space="preserve">Usuario </w:t>
+            </w:r>
+            <w:proofErr w:type="spellStart"/>
+            <w:r>
+              <w:rPr>
+                <w:sz w:val="14"/>
+              </w:rPr>
+              <w:t>autorizado</w:t>
+            </w:r>
+            <w:proofErr w:type="spellEnd"/>
           </w:p>
         </w:tc>
         <w:tc>
@@ -1667,11 +2256,19 @@
             <w:tcW w:w="3024" w:type="dxa"/>
           </w:tcPr>
           <w:p>
-            <w:r>
-              <w:rPr>
-                <w:sz w:val="14"/>
-              </w:rPr>
-              <w:t>buscar lote por código</w:t>
+            <w:proofErr w:type="spellStart"/>
+            <w:r>
+              <w:rPr>
+                <w:sz w:val="14"/>
+              </w:rPr>
+              <w:t>buscar</w:t>
+            </w:r>
+            <w:proofErr w:type="spellEnd"/>
+            <w:r>
+              <w:rPr>
+                <w:sz w:val="14"/>
+              </w:rPr>
+              <w:t xml:space="preserve"> lote por código</w:t>
             </w:r>
           </w:p>
         </w:tc>
@@ -1680,12 +2277,28 @@
             <w:tcW w:w="3168" w:type="dxa"/>
           </w:tcPr>
           <w:p>
-            <w:r>
-              <w:rPr>
-                <w:sz w:val="14"/>
-              </w:rPr>
-              <w:t>consultar la trazabilidad básica</w:t>
-            </w:r>
+            <w:proofErr w:type="spellStart"/>
+            <w:r>
+              <w:rPr>
+                <w:sz w:val="14"/>
+              </w:rPr>
+              <w:t>consultar</w:t>
+            </w:r>
+            <w:proofErr w:type="spellEnd"/>
+            <w:r>
+              <w:rPr>
+                <w:sz w:val="14"/>
+              </w:rPr>
+              <w:t xml:space="preserve"> la trazabilidad </w:t>
+            </w:r>
+            <w:proofErr w:type="spellStart"/>
+            <w:r>
+              <w:rPr>
+                <w:sz w:val="14"/>
+              </w:rPr>
+              <w:t>básica</w:t>
+            </w:r>
+            <w:proofErr w:type="spellEnd"/>
           </w:p>
         </w:tc>
         <w:tc>
@@ -1697,7 +2310,77 @@
               <w:rPr>
                 <w:sz w:val="14"/>
               </w:rPr>
-              <w:t>Permite escribir código; muestra resumen del lote; informa si no existe.</w:t>
+              <w:t xml:space="preserve">Permite </w:t>
+            </w:r>
+            <w:proofErr w:type="spellStart"/>
+            <w:r>
+              <w:rPr>
+                <w:sz w:val="14"/>
+              </w:rPr>
+              <w:t>escribir</w:t>
+            </w:r>
+            <w:proofErr w:type="spellEnd"/>
+            <w:r>
+              <w:rPr>
+                <w:sz w:val="14"/>
+              </w:rPr>
+              <w:t xml:space="preserve"> código; muestra </w:t>
+            </w:r>
+            <w:proofErr w:type="spellStart"/>
+            <w:r>
+              <w:rPr>
+                <w:sz w:val="14"/>
+              </w:rPr>
+              <w:t>resumen</w:t>
+            </w:r>
+            <w:proofErr w:type="spellEnd"/>
+            <w:r>
+              <w:rPr>
+                <w:sz w:val="14"/>
+              </w:rPr>
+              <w:t xml:space="preserve"> del lote; </w:t>
+            </w:r>
+            <w:proofErr w:type="spellStart"/>
+            <w:r>
+              <w:rPr>
+                <w:sz w:val="14"/>
+              </w:rPr>
+              <w:t>informa</w:t>
+            </w:r>
+            <w:proofErr w:type="spellEnd"/>
+            <w:r>
+              <w:rPr>
+                <w:sz w:val="14"/>
+              </w:rPr>
+              <w:t xml:space="preserve"> </w:t>
+            </w:r>
+            <w:proofErr w:type="spellStart"/>
+            <w:r>
+              <w:rPr>
+                <w:sz w:val="14"/>
+              </w:rPr>
+              <w:t>si</w:t>
+            </w:r>
+            <w:proofErr w:type="spellEnd"/>
+            <w:r>
+              <w:rPr>
+                <w:sz w:val="14"/>
+              </w:rPr>
+              <w:t xml:space="preserve"> no </w:t>
+            </w:r>
+            <w:proofErr w:type="spellStart"/>
+            <w:r>
+              <w:rPr>
+                <w:sz w:val="14"/>
+              </w:rPr>
+              <w:t>existe</w:t>
+            </w:r>
+            <w:proofErr w:type="spellEnd"/>
+            <w:r>
+              <w:rPr>
+                <w:sz w:val="14"/>
+              </w:rPr>
+              <w:t>.</w:t>
             </w:r>
           </w:p>
         </w:tc>
@@ -1878,11 +2561,19 @@
             <w:tcW w:w="2448" w:type="dxa"/>
           </w:tcPr>
           <w:p>
-            <w:r>
-              <w:rPr>
-                <w:sz w:val="14"/>
-              </w:rPr>
-              <w:t>Encargado de calidad</w:t>
+            <w:proofErr w:type="spellStart"/>
+            <w:r>
+              <w:rPr>
+                <w:sz w:val="14"/>
+              </w:rPr>
+              <w:t>Encargado</w:t>
+            </w:r>
+            <w:proofErr w:type="spellEnd"/>
+            <w:r>
+              <w:rPr>
+                <w:sz w:val="14"/>
+              </w:rPr>
+              <w:t xml:space="preserve"> de calidad</w:t>
             </w:r>
           </w:p>
         </w:tc>
@@ -1904,11 +2595,19 @@
             <w:tcW w:w="3024" w:type="dxa"/>
           </w:tcPr>
           <w:p>
-            <w:r>
-              <w:rPr>
-                <w:sz w:val="14"/>
-              </w:rPr>
-              <w:t>Clasificar el lote</w:t>
+            <w:proofErr w:type="spellStart"/>
+            <w:r>
+              <w:rPr>
+                <w:sz w:val="14"/>
+              </w:rPr>
+              <w:t>Clasificar</w:t>
+            </w:r>
+            <w:proofErr w:type="spellEnd"/>
+            <w:r>
+              <w:rPr>
+                <w:sz w:val="14"/>
+              </w:rPr>
+              <w:t xml:space="preserve"> el lote</w:t>
             </w:r>
           </w:p>
         </w:tc>
@@ -1974,11 +2673,19 @@
             <w:tcW w:w="2448" w:type="dxa"/>
           </w:tcPr>
           <w:p>
-            <w:r>
-              <w:rPr>
-                <w:sz w:val="14"/>
-              </w:rPr>
-              <w:t>Encargado de calidad</w:t>
+            <w:proofErr w:type="spellStart"/>
+            <w:r>
+              <w:rPr>
+                <w:sz w:val="14"/>
+              </w:rPr>
+              <w:t>Encargado</w:t>
+            </w:r>
+            <w:proofErr w:type="spellEnd"/>
+            <w:r>
+              <w:rPr>
+                <w:sz w:val="14"/>
+              </w:rPr>
+              <w:t xml:space="preserve"> de calidad</w:t>
             </w:r>
           </w:p>
         </w:tc>
@@ -2000,12 +2707,42 @@
             <w:tcW w:w="3024" w:type="dxa"/>
           </w:tcPr>
           <w:p>
-            <w:r>
-              <w:rPr>
-                <w:sz w:val="14"/>
-              </w:rPr>
-              <w:t>Seguir fermentación y secado</w:t>
-            </w:r>
+            <w:proofErr w:type="spellStart"/>
+            <w:r>
+              <w:rPr>
+                <w:sz w:val="14"/>
+              </w:rPr>
+              <w:t>Seguir</w:t>
+            </w:r>
+            <w:proofErr w:type="spellEnd"/>
+            <w:r>
+              <w:rPr>
+                <w:sz w:val="14"/>
+              </w:rPr>
+              <w:t xml:space="preserve"> </w:t>
+            </w:r>
+            <w:proofErr w:type="spellStart"/>
+            <w:r>
+              <w:rPr>
+                <w:sz w:val="14"/>
+              </w:rPr>
+              <w:t>fermentación</w:t>
+            </w:r>
+            <w:proofErr w:type="spellEnd"/>
+            <w:r>
+              <w:rPr>
+                <w:sz w:val="14"/>
+              </w:rPr>
+              <w:t xml:space="preserve"> y </w:t>
+            </w:r>
+            <w:proofErr w:type="spellStart"/>
+            <w:r>
+              <w:rPr>
+                <w:sz w:val="14"/>
+              </w:rPr>
+              <w:t>secado</w:t>
+            </w:r>
+            <w:proofErr w:type="spellEnd"/>
           </w:p>
         </w:tc>
         <w:tc>
@@ -2074,8 +2811,16 @@
               <w:rPr>
                 <w:sz w:val="14"/>
               </w:rPr>
-              <w:t>Usuario autorizado</w:t>
-            </w:r>
+              <w:t xml:space="preserve">Usuario </w:t>
+            </w:r>
+            <w:proofErr w:type="spellStart"/>
+            <w:r>
+              <w:rPr>
+                <w:sz w:val="14"/>
+              </w:rPr>
+              <w:t>autorizado</w:t>
+            </w:r>
+            <w:proofErr w:type="spellEnd"/>
           </w:p>
         </w:tc>
         <w:tc>
@@ -2083,11 +2828,19 @@
             <w:tcW w:w="2880" w:type="dxa"/>
           </w:tcPr>
           <w:p>
-            <w:r>
-              <w:rPr>
-                <w:sz w:val="14"/>
-              </w:rPr>
-              <w:t>Buscar lote por código</w:t>
+            <w:proofErr w:type="spellStart"/>
+            <w:r>
+              <w:rPr>
+                <w:sz w:val="14"/>
+              </w:rPr>
+              <w:t>Buscar</w:t>
+            </w:r>
+            <w:proofErr w:type="spellEnd"/>
+            <w:r>
+              <w:rPr>
+                <w:sz w:val="14"/>
+              </w:rPr>
+              <w:t xml:space="preserve"> lote por código</w:t>
             </w:r>
           </w:p>
         </w:tc>
@@ -2096,12 +2849,28 @@
             <w:tcW w:w="3024" w:type="dxa"/>
           </w:tcPr>
           <w:p>
-            <w:r>
-              <w:rPr>
-                <w:sz w:val="14"/>
-              </w:rPr>
-              <w:t>Consultar trazabilidad básica</w:t>
-            </w:r>
+            <w:proofErr w:type="spellStart"/>
+            <w:r>
+              <w:rPr>
+                <w:sz w:val="14"/>
+              </w:rPr>
+              <w:t>Consultar</w:t>
+            </w:r>
+            <w:proofErr w:type="spellEnd"/>
+            <w:r>
+              <w:rPr>
+                <w:sz w:val="14"/>
+              </w:rPr>
+              <w:t xml:space="preserve"> trazabilidad </w:t>
+            </w:r>
+            <w:proofErr w:type="spellStart"/>
+            <w:r>
+              <w:rPr>
+                <w:sz w:val="14"/>
+              </w:rPr>
+              <w:t>básica</w:t>
+            </w:r>
+            <w:proofErr w:type="spellEnd"/>
           </w:p>
         </w:tc>
         <w:tc>
@@ -2626,11 +3395,61 @@
             <w:tcW w:w="7056" w:type="dxa"/>
           </w:tcPr>
           <w:p>
+            <w:proofErr w:type="spellStart"/>
             <w:r>
               <w:rPr>
                 <w:sz w:val="16"/>
               </w:rPr>
-              <w:t>Humedad, estado, clasificación y observaciones guardadas.</w:t>
+              <w:t>Humedad</w:t>
+            </w:r>
+            <w:proofErr w:type="spellEnd"/>
+            <w:r>
+              <w:rPr>
+                <w:sz w:val="16"/>
+              </w:rPr>
+              <w:t xml:space="preserve">, estado, </w:t>
+            </w:r>
+            <w:proofErr w:type="spellStart"/>
+            <w:r>
+              <w:rPr>
+                <w:sz w:val="16"/>
+              </w:rPr>
+              <w:t>clasificación</w:t>
+            </w:r>
+            <w:proofErr w:type="spellEnd"/>
+            <w:r>
+              <w:rPr>
+                <w:sz w:val="16"/>
+              </w:rPr>
+              <w:t xml:space="preserve"> y </w:t>
+            </w:r>
+            <w:proofErr w:type="spellStart"/>
+            <w:r>
+              <w:rPr>
+                <w:sz w:val="16"/>
+              </w:rPr>
+              <w:t>observaciones</w:t>
+            </w:r>
+            <w:proofErr w:type="spellEnd"/>
+            <w:r>
+              <w:rPr>
+                <w:sz w:val="16"/>
+              </w:rPr>
+              <w:t xml:space="preserve"> </w:t>
+            </w:r>
+            <w:proofErr w:type="spellStart"/>
+            <w:r>
+              <w:rPr>
+                <w:sz w:val="16"/>
+              </w:rPr>
+              <w:t>guardadas</w:t>
+            </w:r>
+            <w:proofErr w:type="spellEnd"/>
+            <w:r>
+              <w:rPr>
+                <w:sz w:val="16"/>
+              </w:rPr>
+              <w:t>.</w:t>
             </w:r>
           </w:p>
         </w:tc>
@@ -2683,11 +3502,61 @@
             <w:tcW w:w="7056" w:type="dxa"/>
           </w:tcPr>
           <w:p>
+            <w:proofErr w:type="spellStart"/>
             <w:r>
               <w:rPr>
                 <w:sz w:val="16"/>
               </w:rPr>
-              <w:t>Etapas de fermentación y secado registradas.</w:t>
+              <w:t>Etapas</w:t>
+            </w:r>
+            <w:proofErr w:type="spellEnd"/>
+            <w:r>
+              <w:rPr>
+                <w:sz w:val="16"/>
+              </w:rPr>
+              <w:t xml:space="preserve"> de </w:t>
+            </w:r>
+            <w:proofErr w:type="spellStart"/>
+            <w:r>
+              <w:rPr>
+                <w:sz w:val="16"/>
+              </w:rPr>
+              <w:t>fermentación</w:t>
+            </w:r>
+            <w:proofErr w:type="spellEnd"/>
+            <w:r>
+              <w:rPr>
+                <w:sz w:val="16"/>
+              </w:rPr>
+              <w:t xml:space="preserve"> y </w:t>
+            </w:r>
+            <w:proofErr w:type="spellStart"/>
+            <w:r>
+              <w:rPr>
+                <w:sz w:val="16"/>
+              </w:rPr>
+              <w:t>secado</w:t>
+            </w:r>
+            <w:proofErr w:type="spellEnd"/>
+            <w:r>
+              <w:rPr>
+                <w:sz w:val="16"/>
+              </w:rPr>
+              <w:t xml:space="preserve"> </w:t>
+            </w:r>
+            <w:proofErr w:type="spellStart"/>
+            <w:r>
+              <w:rPr>
+                <w:sz w:val="16"/>
+              </w:rPr>
+              <w:t>registradas</w:t>
+            </w:r>
+            <w:proofErr w:type="spellEnd"/>
+            <w:r>
+              <w:rPr>
+                <w:sz w:val="16"/>
+              </w:rPr>
+              <w:t>.</w:t>
             </w:r>
           </w:p>
         </w:tc>
@@ -2714,11 +3583,19 @@
             <w:tcW w:w="4320" w:type="dxa"/>
           </w:tcPr>
           <w:p>
+            <w:proofErr w:type="spellStart"/>
             <w:r>
               <w:rPr>
                 <w:sz w:val="16"/>
               </w:rPr>
-              <w:t>Buscar lote por código</w:t>
+              <w:t>Buscar</w:t>
+            </w:r>
+            <w:proofErr w:type="spellEnd"/>
+            <w:r>
+              <w:rPr>
+                <w:sz w:val="16"/>
+              </w:rPr>
+              <w:t xml:space="preserve"> lote por código</w:t>
             </w:r>
           </w:p>
         </w:tc>
@@ -2744,7 +3621,35 @@
               <w:rPr>
                 <w:sz w:val="16"/>
               </w:rPr>
-              <w:t>Consulta muestra resumen de trazabilidad básica.</w:t>
+              <w:t xml:space="preserve">Consulta muestra </w:t>
+            </w:r>
+            <w:proofErr w:type="spellStart"/>
+            <w:r>
+              <w:rPr>
+                <w:sz w:val="16"/>
+              </w:rPr>
+              <w:t>resumen</w:t>
+            </w:r>
+            <w:proofErr w:type="spellEnd"/>
+            <w:r>
+              <w:rPr>
+                <w:sz w:val="16"/>
+              </w:rPr>
+              <w:t xml:space="preserve"> de trazabilidad </w:t>
+            </w:r>
+            <w:proofErr w:type="spellStart"/>
+            <w:r>
+              <w:rPr>
+                <w:sz w:val="16"/>
+              </w:rPr>
+              <w:t>básica</w:t>
+            </w:r>
+            <w:proofErr w:type="spellEnd"/>
+            <w:r>
+              <w:rPr>
+                <w:sz w:val="16"/>
+              </w:rPr>
+              <w:t>.</w:t>
             </w:r>
           </w:p>
         </w:tc>
@@ -2896,8 +3801,16 @@
               <w:rPr>
                 <w:sz w:val="14"/>
               </w:rPr>
-              <w:t>Crear tabla controles_calidad</w:t>
-            </w:r>
+              <w:t xml:space="preserve">Crear tabla </w:t>
+            </w:r>
+            <w:proofErr w:type="spellStart"/>
+            <w:r>
+              <w:rPr>
+                <w:sz w:val="14"/>
+              </w:rPr>
+              <w:t>controles_calidad</w:t>
+            </w:r>
+            <w:proofErr w:type="spellEnd"/>
           </w:p>
         </w:tc>
         <w:tc>
@@ -2922,8 +3835,58 @@
               <w:rPr>
                 <w:sz w:val="14"/>
               </w:rPr>
-              <w:t>Tabla creada con lote, humedad, estado, clasificación y observaciones</w:t>
-            </w:r>
+              <w:t xml:space="preserve">Tabla </w:t>
+            </w:r>
+            <w:proofErr w:type="spellStart"/>
+            <w:r>
+              <w:rPr>
+                <w:sz w:val="14"/>
+              </w:rPr>
+              <w:t>creada</w:t>
+            </w:r>
+            <w:proofErr w:type="spellEnd"/>
+            <w:r>
+              <w:rPr>
+                <w:sz w:val="14"/>
+              </w:rPr>
+              <w:t xml:space="preserve"> con lote, </w:t>
+            </w:r>
+            <w:proofErr w:type="spellStart"/>
+            <w:r>
+              <w:rPr>
+                <w:sz w:val="14"/>
+              </w:rPr>
+              <w:t>humedad</w:t>
+            </w:r>
+            <w:proofErr w:type="spellEnd"/>
+            <w:r>
+              <w:rPr>
+                <w:sz w:val="14"/>
+              </w:rPr>
+              <w:t xml:space="preserve">, estado, </w:t>
+            </w:r>
+            <w:proofErr w:type="spellStart"/>
+            <w:r>
+              <w:rPr>
+                <w:sz w:val="14"/>
+              </w:rPr>
+              <w:t>clasificación</w:t>
+            </w:r>
+            <w:proofErr w:type="spellEnd"/>
+            <w:r>
+              <w:rPr>
+                <w:sz w:val="14"/>
+              </w:rPr>
+              <w:t xml:space="preserve"> y </w:t>
+            </w:r>
+            <w:proofErr w:type="spellStart"/>
+            <w:r>
+              <w:rPr>
+                <w:sz w:val="14"/>
+              </w:rPr>
+              <w:t>observaciones</w:t>
+            </w:r>
+            <w:proofErr w:type="spellEnd"/>
           </w:p>
         </w:tc>
         <w:tc>
@@ -2966,7 +3929,21 @@
               <w:rPr>
                 <w:sz w:val="14"/>
               </w:rPr>
-              <w:t>Crear tabla o estructura para etapas de poscosecha</w:t>
+              <w:t xml:space="preserve">Crear tabla o estructura para </w:t>
+            </w:r>
+            <w:proofErr w:type="spellStart"/>
+            <w:r>
+              <w:rPr>
+                <w:sz w:val="14"/>
+              </w:rPr>
+              <w:t>etapas</w:t>
+            </w:r>
+            <w:proofErr w:type="spellEnd"/>
+            <w:r>
+              <w:rPr>
+                <w:sz w:val="14"/>
+              </w:rPr>
+              <w:t xml:space="preserve"> de poscosecha</w:t>
             </w:r>
           </w:p>
         </w:tc>
@@ -2992,7 +3969,35 @@
               <w:rPr>
                 <w:sz w:val="14"/>
               </w:rPr>
-              <w:t>Permite registrar fermentación, secado y estado</w:t>
+              <w:t xml:space="preserve">Permite registrar </w:t>
+            </w:r>
+            <w:proofErr w:type="spellStart"/>
+            <w:r>
+              <w:rPr>
+                <w:sz w:val="14"/>
+              </w:rPr>
+              <w:t>fermentación</w:t>
+            </w:r>
+            <w:proofErr w:type="spellEnd"/>
+            <w:r>
+              <w:rPr>
+                <w:sz w:val="14"/>
+              </w:rPr>
+              <w:t xml:space="preserve">, </w:t>
+            </w:r>
+            <w:proofErr w:type="spellStart"/>
+            <w:r>
+              <w:rPr>
+                <w:sz w:val="14"/>
+              </w:rPr>
+              <w:t>secado</w:t>
+            </w:r>
+            <w:proofErr w:type="spellEnd"/>
+            <w:r>
+              <w:rPr>
+                <w:sz w:val="14"/>
+              </w:rPr>
+              <w:t xml:space="preserve"> y estado</w:t>
             </w:r>
           </w:p>
         </w:tc>
@@ -3032,11 +4037,33 @@
             <w:tcW w:w="4608" w:type="dxa"/>
           </w:tcPr>
           <w:p>
-            <w:r>
-              <w:rPr>
-                <w:sz w:val="14"/>
-              </w:rPr>
-              <w:t>Diseñar formulario de control de calidad</w:t>
+            <w:proofErr w:type="spellStart"/>
+            <w:r>
+              <w:rPr>
+                <w:sz w:val="14"/>
+              </w:rPr>
+              <w:t>Diseñar</w:t>
+            </w:r>
+            <w:proofErr w:type="spellEnd"/>
+            <w:r>
+              <w:rPr>
+                <w:sz w:val="14"/>
+              </w:rPr>
+              <w:t xml:space="preserve"> </w:t>
+            </w:r>
+            <w:proofErr w:type="spellStart"/>
+            <w:r>
+              <w:rPr>
+                <w:sz w:val="14"/>
+              </w:rPr>
+              <w:t>formulario</w:t>
+            </w:r>
+            <w:proofErr w:type="spellEnd"/>
+            <w:r>
+              <w:rPr>
+                <w:sz w:val="14"/>
+              </w:rPr>
+              <w:t xml:space="preserve"> de control de calidad</w:t>
             </w:r>
           </w:p>
         </w:tc>
@@ -3058,12 +4085,56 @@
             <w:tcW w:w="4896" w:type="dxa"/>
           </w:tcPr>
           <w:p>
-            <w:r>
-              <w:rPr>
-                <w:sz w:val="14"/>
-              </w:rPr>
-              <w:t>Formulario claro para humedad, estado, clasificación y observaciones</w:t>
-            </w:r>
+            <w:proofErr w:type="spellStart"/>
+            <w:r>
+              <w:rPr>
+                <w:sz w:val="14"/>
+              </w:rPr>
+              <w:t>Formulario</w:t>
+            </w:r>
+            <w:proofErr w:type="spellEnd"/>
+            <w:r>
+              <w:rPr>
+                <w:sz w:val="14"/>
+              </w:rPr>
+              <w:t xml:space="preserve"> claro para </w:t>
+            </w:r>
+            <w:proofErr w:type="spellStart"/>
+            <w:r>
+              <w:rPr>
+                <w:sz w:val="14"/>
+              </w:rPr>
+              <w:t>humedad</w:t>
+            </w:r>
+            <w:proofErr w:type="spellEnd"/>
+            <w:r>
+              <w:rPr>
+                <w:sz w:val="14"/>
+              </w:rPr>
+              <w:t xml:space="preserve">, estado, </w:t>
+            </w:r>
+            <w:proofErr w:type="spellStart"/>
+            <w:r>
+              <w:rPr>
+                <w:sz w:val="14"/>
+              </w:rPr>
+              <w:t>clasificación</w:t>
+            </w:r>
+            <w:proofErr w:type="spellEnd"/>
+            <w:r>
+              <w:rPr>
+                <w:sz w:val="14"/>
+              </w:rPr>
+              <w:t xml:space="preserve"> y </w:t>
+            </w:r>
+            <w:proofErr w:type="spellStart"/>
+            <w:r>
+              <w:rPr>
+                <w:sz w:val="14"/>
+              </w:rPr>
+              <w:t>observaciones</w:t>
+            </w:r>
+            <w:proofErr w:type="spellEnd"/>
           </w:p>
         </w:tc>
         <w:tc>
@@ -3106,8 +4177,16 @@
               <w:rPr>
                 <w:sz w:val="14"/>
               </w:rPr>
-              <w:t>Implementar validación de humedad</w:t>
-            </w:r>
+              <w:t xml:space="preserve">Implementar validación de </w:t>
+            </w:r>
+            <w:proofErr w:type="spellStart"/>
+            <w:r>
+              <w:rPr>
+                <w:sz w:val="14"/>
+              </w:rPr>
+              <w:t>humedad</w:t>
+            </w:r>
+            <w:proofErr w:type="spellEnd"/>
           </w:p>
         </w:tc>
         <w:tc>
@@ -3132,8 +4211,72 @@
               <w:rPr>
                 <w:sz w:val="14"/>
               </w:rPr>
-              <w:t>Solo permite valores numéricos dentro de rango definido</w:t>
-            </w:r>
+              <w:t xml:space="preserve">Solo permite </w:t>
+            </w:r>
+            <w:proofErr w:type="spellStart"/>
+            <w:r>
+              <w:rPr>
+                <w:sz w:val="14"/>
+              </w:rPr>
+              <w:t>valores</w:t>
+            </w:r>
+            <w:proofErr w:type="spellEnd"/>
+            <w:r>
+              <w:rPr>
+                <w:sz w:val="14"/>
+              </w:rPr>
+              <w:t xml:space="preserve"> </w:t>
+            </w:r>
+            <w:proofErr w:type="spellStart"/>
+            <w:r>
+              <w:rPr>
+                <w:sz w:val="14"/>
+              </w:rPr>
+              <w:t>numéricos</w:t>
+            </w:r>
+            <w:proofErr w:type="spellEnd"/>
+            <w:r>
+              <w:rPr>
+                <w:sz w:val="14"/>
+              </w:rPr>
+              <w:t xml:space="preserve"> </w:t>
+            </w:r>
+            <w:proofErr w:type="spellStart"/>
+            <w:r>
+              <w:rPr>
+                <w:sz w:val="14"/>
+              </w:rPr>
+              <w:t>dentro</w:t>
+            </w:r>
+            <w:proofErr w:type="spellEnd"/>
+            <w:r>
+              <w:rPr>
+                <w:sz w:val="14"/>
+              </w:rPr>
+              <w:t xml:space="preserve"> de </w:t>
+            </w:r>
+            <w:proofErr w:type="spellStart"/>
+            <w:r>
+              <w:rPr>
+                <w:sz w:val="14"/>
+              </w:rPr>
+              <w:t>rango</w:t>
+            </w:r>
+            <w:proofErr w:type="spellEnd"/>
+            <w:r>
+              <w:rPr>
+                <w:sz w:val="14"/>
+              </w:rPr>
+              <w:t xml:space="preserve"> </w:t>
+            </w:r>
+            <w:proofErr w:type="spellStart"/>
+            <w:r>
+              <w:rPr>
+                <w:sz w:val="14"/>
+              </w:rPr>
+              <w:t>definido</w:t>
+            </w:r>
+            <w:proofErr w:type="spellEnd"/>
           </w:p>
         </w:tc>
         <w:tc>
@@ -3172,12 +4315,42 @@
             <w:tcW w:w="4608" w:type="dxa"/>
           </w:tcPr>
           <w:p>
-            <w:r>
-              <w:rPr>
-                <w:sz w:val="14"/>
-              </w:rPr>
-              <w:t>Actualizar estado del lote según calidad registrada</w:t>
-            </w:r>
+            <w:proofErr w:type="spellStart"/>
+            <w:r>
+              <w:rPr>
+                <w:sz w:val="14"/>
+              </w:rPr>
+              <w:t>Actualizar</w:t>
+            </w:r>
+            <w:proofErr w:type="spellEnd"/>
+            <w:r>
+              <w:rPr>
+                <w:sz w:val="14"/>
+              </w:rPr>
+              <w:t xml:space="preserve"> estado del lote </w:t>
+            </w:r>
+            <w:proofErr w:type="spellStart"/>
+            <w:r>
+              <w:rPr>
+                <w:sz w:val="14"/>
+              </w:rPr>
+              <w:t>según</w:t>
+            </w:r>
+            <w:proofErr w:type="spellEnd"/>
+            <w:r>
+              <w:rPr>
+                <w:sz w:val="14"/>
+              </w:rPr>
+              <w:t xml:space="preserve"> calidad </w:t>
+            </w:r>
+            <w:proofErr w:type="spellStart"/>
+            <w:r>
+              <w:rPr>
+                <w:sz w:val="14"/>
+              </w:rPr>
+              <w:t>registrada</w:t>
+            </w:r>
+            <w:proofErr w:type="spellEnd"/>
           </w:p>
         </w:tc>
         <w:tc>
@@ -3202,7 +4375,35 @@
               <w:rPr>
                 <w:sz w:val="14"/>
               </w:rPr>
-              <w:t>El lote cambia a clasificado o en revisión según datos</w:t>
+              <w:t xml:space="preserve">El lote cambia a </w:t>
+            </w:r>
+            <w:proofErr w:type="spellStart"/>
+            <w:r>
+              <w:rPr>
+                <w:sz w:val="14"/>
+              </w:rPr>
+              <w:t>clasificado</w:t>
+            </w:r>
+            <w:proofErr w:type="spellEnd"/>
+            <w:r>
+              <w:rPr>
+                <w:sz w:val="14"/>
+              </w:rPr>
+              <w:t xml:space="preserve"> o en revisión </w:t>
+            </w:r>
+            <w:proofErr w:type="spellStart"/>
+            <w:r>
+              <w:rPr>
+                <w:sz w:val="14"/>
+              </w:rPr>
+              <w:t>según</w:t>
+            </w:r>
+            <w:proofErr w:type="spellEnd"/>
+            <w:r>
+              <w:rPr>
+                <w:sz w:val="14"/>
+              </w:rPr>
+              <w:t xml:space="preserve"> datos</w:t>
             </w:r>
           </w:p>
         </w:tc>
@@ -3242,11 +4443,33 @@
             <w:tcW w:w="4608" w:type="dxa"/>
           </w:tcPr>
           <w:p>
-            <w:r>
-              <w:rPr>
-                <w:sz w:val="14"/>
-              </w:rPr>
-              <w:t>Diseñar formulario de poscosecha</w:t>
+            <w:proofErr w:type="spellStart"/>
+            <w:r>
+              <w:rPr>
+                <w:sz w:val="14"/>
+              </w:rPr>
+              <w:t>Diseñar</w:t>
+            </w:r>
+            <w:proofErr w:type="spellEnd"/>
+            <w:r>
+              <w:rPr>
+                <w:sz w:val="14"/>
+              </w:rPr>
+              <w:t xml:space="preserve"> </w:t>
+            </w:r>
+            <w:proofErr w:type="spellStart"/>
+            <w:r>
+              <w:rPr>
+                <w:sz w:val="14"/>
+              </w:rPr>
+              <w:t>formulario</w:t>
+            </w:r>
+            <w:proofErr w:type="spellEnd"/>
+            <w:r>
+              <w:rPr>
+                <w:sz w:val="14"/>
+              </w:rPr>
+              <w:t xml:space="preserve"> de poscosecha</w:t>
             </w:r>
           </w:p>
         </w:tc>
@@ -3272,8 +4495,30 @@
               <w:rPr>
                 <w:sz w:val="14"/>
               </w:rPr>
-              <w:t>Permite registrar etapa, fecha, estado y observaciones</w:t>
-            </w:r>
+              <w:t xml:space="preserve">Permite registrar </w:t>
+            </w:r>
+            <w:proofErr w:type="spellStart"/>
+            <w:r>
+              <w:rPr>
+                <w:sz w:val="14"/>
+              </w:rPr>
+              <w:t>etapa</w:t>
+            </w:r>
+            <w:proofErr w:type="spellEnd"/>
+            <w:r>
+              <w:rPr>
+                <w:sz w:val="14"/>
+              </w:rPr>
+              <w:t xml:space="preserve">, fecha, estado y </w:t>
+            </w:r>
+            <w:proofErr w:type="spellStart"/>
+            <w:r>
+              <w:rPr>
+                <w:sz w:val="14"/>
+              </w:rPr>
+              <w:t>observaciones</w:t>
+            </w:r>
+            <w:proofErr w:type="spellEnd"/>
           </w:p>
         </w:tc>
         <w:tc>
@@ -3316,7 +4561,21 @@
               <w:rPr>
                 <w:sz w:val="14"/>
               </w:rPr>
-              <w:t>Crear buscador por código de lote</w:t>
+              <w:t xml:space="preserve">Crear </w:t>
+            </w:r>
+            <w:proofErr w:type="spellStart"/>
+            <w:r>
+              <w:rPr>
+                <w:sz w:val="14"/>
+              </w:rPr>
+              <w:t>buscador</w:t>
+            </w:r>
+            <w:proofErr w:type="spellEnd"/>
+            <w:r>
+              <w:rPr>
+                <w:sz w:val="14"/>
+              </w:rPr>
+              <w:t xml:space="preserve"> por código de lote</w:t>
             </w:r>
           </w:p>
         </w:tc>
@@ -3342,8 +4601,44 @@
               <w:rPr>
                 <w:sz w:val="14"/>
               </w:rPr>
-              <w:t>Muestra resumen del lote o mensaje de no encontrado</w:t>
-            </w:r>
+              <w:t xml:space="preserve">Muestra </w:t>
+            </w:r>
+            <w:proofErr w:type="spellStart"/>
+            <w:r>
+              <w:rPr>
+                <w:sz w:val="14"/>
+              </w:rPr>
+              <w:t>resumen</w:t>
+            </w:r>
+            <w:proofErr w:type="spellEnd"/>
+            <w:r>
+              <w:rPr>
+                <w:sz w:val="14"/>
+              </w:rPr>
+              <w:t xml:space="preserve"> del lote o </w:t>
+            </w:r>
+            <w:proofErr w:type="spellStart"/>
+            <w:r>
+              <w:rPr>
+                <w:sz w:val="14"/>
+              </w:rPr>
+              <w:t>mensaje</w:t>
+            </w:r>
+            <w:proofErr w:type="spellEnd"/>
+            <w:r>
+              <w:rPr>
+                <w:sz w:val="14"/>
+              </w:rPr>
+              <w:t xml:space="preserve"> de no </w:t>
+            </w:r>
+            <w:proofErr w:type="spellStart"/>
+            <w:r>
+              <w:rPr>
+                <w:sz w:val="14"/>
+              </w:rPr>
+              <w:t>encontrado</w:t>
+            </w:r>
+            <w:proofErr w:type="spellEnd"/>
           </w:p>
         </w:tc>
         <w:tc>
@@ -3382,11 +4677,33 @@
             <w:tcW w:w="4608" w:type="dxa"/>
           </w:tcPr>
           <w:p>
-            <w:r>
-              <w:rPr>
-                <w:sz w:val="14"/>
-              </w:rPr>
-              <w:t>Probar registro de calidad y búsqueda por código</w:t>
+            <w:proofErr w:type="spellStart"/>
+            <w:r>
+              <w:rPr>
+                <w:sz w:val="14"/>
+              </w:rPr>
+              <w:t>Probar</w:t>
+            </w:r>
+            <w:proofErr w:type="spellEnd"/>
+            <w:r>
+              <w:rPr>
+                <w:sz w:val="14"/>
+              </w:rPr>
+              <w:t xml:space="preserve"> </w:t>
+            </w:r>
+            <w:proofErr w:type="spellStart"/>
+            <w:r>
+              <w:rPr>
+                <w:sz w:val="14"/>
+              </w:rPr>
+              <w:t>registro</w:t>
+            </w:r>
+            <w:proofErr w:type="spellEnd"/>
+            <w:r>
+              <w:rPr>
+                <w:sz w:val="14"/>
+              </w:rPr>
+              <w:t xml:space="preserve"> de calidad y búsqueda por código</w:t>
             </w:r>
           </w:p>
         </w:tc>
@@ -3412,7 +4729,21 @@
               <w:rPr>
                 <w:sz w:val="14"/>
               </w:rPr>
-              <w:t>Pruebas aprobadas con evidencia</w:t>
+              <w:t xml:space="preserve">Pruebas </w:t>
+            </w:r>
+            <w:proofErr w:type="spellStart"/>
+            <w:r>
+              <w:rPr>
+                <w:sz w:val="14"/>
+              </w:rPr>
+              <w:t>aprobadas</w:t>
+            </w:r>
+            <w:proofErr w:type="spellEnd"/>
+            <w:r>
+              <w:rPr>
+                <w:sz w:val="14"/>
+              </w:rPr>
+              <w:t xml:space="preserve"> con evidencia</w:t>
             </w:r>
           </w:p>
         </w:tc>
@@ -3452,12 +4783,28 @@
             <w:tcW w:w="4608" w:type="dxa"/>
           </w:tcPr>
           <w:p>
-            <w:r>
-              <w:rPr>
-                <w:sz w:val="14"/>
-              </w:rPr>
-              <w:t>Actualizar documentación técnica de módulos nuevos</w:t>
-            </w:r>
+            <w:proofErr w:type="spellStart"/>
+            <w:r>
+              <w:rPr>
+                <w:sz w:val="14"/>
+              </w:rPr>
+              <w:t>Actualizar</w:t>
+            </w:r>
+            <w:proofErr w:type="spellEnd"/>
+            <w:r>
+              <w:rPr>
+                <w:sz w:val="14"/>
+              </w:rPr>
+              <w:t xml:space="preserve"> documentación técnica de módulos </w:t>
+            </w:r>
+            <w:proofErr w:type="spellStart"/>
+            <w:r>
+              <w:rPr>
+                <w:sz w:val="14"/>
+              </w:rPr>
+              <w:t>nuevos</w:t>
+            </w:r>
+            <w:proofErr w:type="spellEnd"/>
           </w:p>
         </w:tc>
         <w:tc>
@@ -3482,8 +4829,16 @@
               <w:rPr>
                 <w:sz w:val="14"/>
               </w:rPr>
-              <w:t>README o documento técnico actualizado</w:t>
-            </w:r>
+              <w:t xml:space="preserve">README o documento técnico </w:t>
+            </w:r>
+            <w:proofErr w:type="spellStart"/>
+            <w:r>
+              <w:rPr>
+                <w:sz w:val="14"/>
+              </w:rPr>
+              <w:t>actualizado</w:t>
+            </w:r>
+            <w:proofErr w:type="spellEnd"/>
           </w:p>
         </w:tc>
         <w:tc>
@@ -3595,7 +4950,21 @@
               <w:rPr>
                 <w:sz w:val="17"/>
               </w:rPr>
-              <w:t>Módulo de calidad, poscosecha y consulta por código funcionando.</w:t>
+              <w:t xml:space="preserve">Módulo de calidad, poscosecha y consulta por código </w:t>
+            </w:r>
+            <w:proofErr w:type="spellStart"/>
+            <w:r>
+              <w:rPr>
+                <w:sz w:val="17"/>
+              </w:rPr>
+              <w:t>funcionando</w:t>
+            </w:r>
+            <w:proofErr w:type="spellEnd"/>
+            <w:r>
+              <w:rPr>
+                <w:sz w:val="17"/>
+              </w:rPr>
+              <w:t>.</w:t>
             </w:r>
           </w:p>
         </w:tc>
@@ -3613,8 +4982,16 @@
               <w:rPr>
                 <w:sz w:val="17"/>
               </w:rPr>
-              <w:t>Base de datos ampliada</w:t>
-            </w:r>
+              <w:t xml:space="preserve">Base de datos </w:t>
+            </w:r>
+            <w:proofErr w:type="spellStart"/>
+            <w:r>
+              <w:rPr>
+                <w:sz w:val="17"/>
+              </w:rPr>
+              <w:t>ampliada</w:t>
+            </w:r>
+            <w:proofErr w:type="spellEnd"/>
           </w:p>
         </w:tc>
         <w:tc>
@@ -3626,7 +5003,21 @@
               <w:rPr>
                 <w:sz w:val="17"/>
               </w:rPr>
-              <w:t>Tabla controles_calidad y estructura de poscosecha.</w:t>
+              <w:t xml:space="preserve">Tabla </w:t>
+            </w:r>
+            <w:proofErr w:type="spellStart"/>
+            <w:r>
+              <w:rPr>
+                <w:sz w:val="17"/>
+              </w:rPr>
+              <w:t>controles_calidad</w:t>
+            </w:r>
+            <w:proofErr w:type="spellEnd"/>
+            <w:r>
+              <w:rPr>
+                <w:sz w:val="17"/>
+              </w:rPr>
+              <w:t xml:space="preserve"> y estructura de poscosecha.</w:t>
             </w:r>
           </w:p>
         </w:tc>
@@ -3657,7 +5048,49 @@
               <w:rPr>
                 <w:sz w:val="17"/>
               </w:rPr>
-              <w:t>Capturas de control de calidad, etapa de secado/fermentación y búsqueda por código.</w:t>
+              <w:t xml:space="preserve">Capturas de control de calidad, </w:t>
+            </w:r>
+            <w:proofErr w:type="spellStart"/>
+            <w:r>
+              <w:rPr>
+                <w:sz w:val="17"/>
+              </w:rPr>
+              <w:t>etapa</w:t>
+            </w:r>
+            <w:proofErr w:type="spellEnd"/>
+            <w:r>
+              <w:rPr>
+                <w:sz w:val="17"/>
+              </w:rPr>
+              <w:t xml:space="preserve"> de </w:t>
+            </w:r>
+            <w:proofErr w:type="spellStart"/>
+            <w:r>
+              <w:rPr>
+                <w:sz w:val="17"/>
+              </w:rPr>
+              <w:t>secado</w:t>
+            </w:r>
+            <w:proofErr w:type="spellEnd"/>
+            <w:r>
+              <w:rPr>
+                <w:sz w:val="17"/>
+              </w:rPr>
+              <w:t>/</w:t>
+            </w:r>
+            <w:proofErr w:type="spellStart"/>
+            <w:r>
+              <w:rPr>
+                <w:sz w:val="17"/>
+              </w:rPr>
+              <w:t>fermentación</w:t>
+            </w:r>
+            <w:proofErr w:type="spellEnd"/>
+            <w:r>
+              <w:rPr>
+                <w:sz w:val="17"/>
+              </w:rPr>
+              <w:t xml:space="preserve"> y búsqueda por código.</w:t>
             </w:r>
           </w:p>
         </w:tc>
@@ -3688,7 +5121,21 @@
               <w:rPr>
                 <w:sz w:val="17"/>
               </w:rPr>
-              <w:t>Commits relacionados con calidad, poscosecha y consulta.</w:t>
+              <w:t xml:space="preserve">Commits </w:t>
+            </w:r>
+            <w:proofErr w:type="spellStart"/>
+            <w:r>
+              <w:rPr>
+                <w:sz w:val="17"/>
+              </w:rPr>
+              <w:t>relacionados</w:t>
+            </w:r>
+            <w:proofErr w:type="spellEnd"/>
+            <w:r>
+              <w:rPr>
+                <w:sz w:val="17"/>
+              </w:rPr>
+              <w:t xml:space="preserve"> con calidad, poscosecha y consulta.</w:t>
             </w:r>
           </w:p>
         </w:tc>
@@ -3788,7 +5235,77 @@
               <w:rPr>
                 <w:sz w:val="17"/>
               </w:rPr>
-              <w:t>El encargado de calidad registra humedad de 8%, estado bueno y clasificación alta; luego consulta el lote por código.</w:t>
+              <w:t xml:space="preserve">El </w:t>
+            </w:r>
+            <w:proofErr w:type="spellStart"/>
+            <w:r>
+              <w:rPr>
+                <w:sz w:val="17"/>
+              </w:rPr>
+              <w:t>encargado</w:t>
+            </w:r>
+            <w:proofErr w:type="spellEnd"/>
+            <w:r>
+              <w:rPr>
+                <w:sz w:val="17"/>
+              </w:rPr>
+              <w:t xml:space="preserve"> de calidad </w:t>
+            </w:r>
+            <w:proofErr w:type="spellStart"/>
+            <w:r>
+              <w:rPr>
+                <w:sz w:val="17"/>
+              </w:rPr>
+              <w:t>registra</w:t>
+            </w:r>
+            <w:proofErr w:type="spellEnd"/>
+            <w:r>
+              <w:rPr>
+                <w:sz w:val="17"/>
+              </w:rPr>
+              <w:t xml:space="preserve"> </w:t>
+            </w:r>
+            <w:proofErr w:type="spellStart"/>
+            <w:r>
+              <w:rPr>
+                <w:sz w:val="17"/>
+              </w:rPr>
+              <w:t>humedad</w:t>
+            </w:r>
+            <w:proofErr w:type="spellEnd"/>
+            <w:r>
+              <w:rPr>
+                <w:sz w:val="17"/>
+              </w:rPr>
+              <w:t xml:space="preserve"> de 8%, estado bueno y </w:t>
+            </w:r>
+            <w:proofErr w:type="spellStart"/>
+            <w:r>
+              <w:rPr>
+                <w:sz w:val="17"/>
+              </w:rPr>
+              <w:t>clasificación</w:t>
+            </w:r>
+            <w:proofErr w:type="spellEnd"/>
+            <w:r>
+              <w:rPr>
+                <w:sz w:val="17"/>
+              </w:rPr>
+              <w:t xml:space="preserve"> </w:t>
+            </w:r>
+            <w:proofErr w:type="spellStart"/>
+            <w:r>
+              <w:rPr>
+                <w:sz w:val="17"/>
+              </w:rPr>
+              <w:t>alta</w:t>
+            </w:r>
+            <w:proofErr w:type="spellEnd"/>
+            <w:r>
+              <w:rPr>
+                <w:sz w:val="17"/>
+              </w:rPr>
+              <w:t>; luego consulta el lote por código.</w:t>
             </w:r>
           </w:p>
         </w:tc>
@@ -3819,7 +5336,63 @@
               <w:rPr>
                 <w:sz w:val="17"/>
               </w:rPr>
-              <w:t>Se confirma que la trazabilidad básica ya muestra origen, recepción, calidad y estado.</w:t>
+              <w:t xml:space="preserve">Se </w:t>
+            </w:r>
+            <w:proofErr w:type="spellStart"/>
+            <w:r>
+              <w:rPr>
+                <w:sz w:val="17"/>
+              </w:rPr>
+              <w:t>confirma</w:t>
+            </w:r>
+            <w:proofErr w:type="spellEnd"/>
+            <w:r>
+              <w:rPr>
+                <w:sz w:val="17"/>
+              </w:rPr>
+              <w:t xml:space="preserve"> que la trazabilidad </w:t>
+            </w:r>
+            <w:proofErr w:type="spellStart"/>
+            <w:r>
+              <w:rPr>
+                <w:sz w:val="17"/>
+              </w:rPr>
+              <w:t>básica</w:t>
+            </w:r>
+            <w:proofErr w:type="spellEnd"/>
+            <w:r>
+              <w:rPr>
+                <w:sz w:val="17"/>
+              </w:rPr>
+              <w:t xml:space="preserve"> </w:t>
+            </w:r>
+            <w:proofErr w:type="spellStart"/>
+            <w:r>
+              <w:rPr>
+                <w:sz w:val="17"/>
+              </w:rPr>
+              <w:t>ya</w:t>
+            </w:r>
+            <w:proofErr w:type="spellEnd"/>
+            <w:r>
+              <w:rPr>
+                <w:sz w:val="17"/>
+              </w:rPr>
+              <w:t xml:space="preserve"> muestra </w:t>
+            </w:r>
+            <w:proofErr w:type="spellStart"/>
+            <w:r>
+              <w:rPr>
+                <w:sz w:val="17"/>
+              </w:rPr>
+              <w:t>origen</w:t>
+            </w:r>
+            <w:proofErr w:type="spellEnd"/>
+            <w:r>
+              <w:rPr>
+                <w:sz w:val="17"/>
+              </w:rPr>
+              <w:t>, recepción, calidad y estado.</w:t>
             </w:r>
           </w:p>
         </w:tc>
@@ -3950,7 +5523,77 @@
               <w:rPr>
                 <w:sz w:val="17"/>
               </w:rPr>
-              <w:t>El sistema empezó a mostrar valor real porque ya no solo registra entrada, sino calidad.</w:t>
+              <w:t xml:space="preserve">El sistema </w:t>
+            </w:r>
+            <w:proofErr w:type="spellStart"/>
+            <w:r>
+              <w:rPr>
+                <w:sz w:val="17"/>
+              </w:rPr>
+              <w:t>empezó</w:t>
+            </w:r>
+            <w:proofErr w:type="spellEnd"/>
+            <w:r>
+              <w:rPr>
+                <w:sz w:val="17"/>
+              </w:rPr>
+              <w:t xml:space="preserve"> a mostrar valor real </w:t>
+            </w:r>
+            <w:proofErr w:type="spellStart"/>
+            <w:r>
+              <w:rPr>
+                <w:sz w:val="17"/>
+              </w:rPr>
+              <w:t>porque</w:t>
+            </w:r>
+            <w:proofErr w:type="spellEnd"/>
+            <w:r>
+              <w:rPr>
+                <w:sz w:val="17"/>
+              </w:rPr>
+              <w:t xml:space="preserve"> </w:t>
+            </w:r>
+            <w:proofErr w:type="spellStart"/>
+            <w:r>
+              <w:rPr>
+                <w:sz w:val="17"/>
+              </w:rPr>
+              <w:t>ya</w:t>
+            </w:r>
+            <w:proofErr w:type="spellEnd"/>
+            <w:r>
+              <w:rPr>
+                <w:sz w:val="17"/>
+              </w:rPr>
+              <w:t xml:space="preserve"> no solo </w:t>
+            </w:r>
+            <w:proofErr w:type="spellStart"/>
+            <w:r>
+              <w:rPr>
+                <w:sz w:val="17"/>
+              </w:rPr>
+              <w:t>registra</w:t>
+            </w:r>
+            <w:proofErr w:type="spellEnd"/>
+            <w:r>
+              <w:rPr>
+                <w:sz w:val="17"/>
+              </w:rPr>
+              <w:t xml:space="preserve"> entrada, </w:t>
+            </w:r>
+            <w:proofErr w:type="spellStart"/>
+            <w:r>
+              <w:rPr>
+                <w:sz w:val="17"/>
+              </w:rPr>
+              <w:t>sino</w:t>
+            </w:r>
+            <w:proofErr w:type="spellEnd"/>
+            <w:r>
+              <w:rPr>
+                <w:sz w:val="17"/>
+              </w:rPr>
+              <w:t xml:space="preserve"> calidad.</w:t>
             </w:r>
           </w:p>
         </w:tc>
@@ -3977,11 +5620,75 @@
             <w:tcW w:w="11376" w:type="dxa"/>
           </w:tcPr>
           <w:p>
+            <w:proofErr w:type="spellStart"/>
             <w:r>
               <w:rPr>
                 <w:sz w:val="17"/>
               </w:rPr>
-              <w:t>Uniformar nombres de estados: recepción, fermentación, secado, inventario, vendido.</w:t>
+              <w:t>Uniformar</w:t>
+            </w:r>
+            <w:proofErr w:type="spellEnd"/>
+            <w:r>
+              <w:rPr>
+                <w:sz w:val="17"/>
+              </w:rPr>
+              <w:t xml:space="preserve"> nombres de </w:t>
+            </w:r>
+            <w:proofErr w:type="spellStart"/>
+            <w:r>
+              <w:rPr>
+                <w:sz w:val="17"/>
+              </w:rPr>
+              <w:t>estados</w:t>
+            </w:r>
+            <w:proofErr w:type="spellEnd"/>
+            <w:r>
+              <w:rPr>
+                <w:sz w:val="17"/>
+              </w:rPr>
+              <w:t xml:space="preserve">: recepción, </w:t>
+            </w:r>
+            <w:proofErr w:type="spellStart"/>
+            <w:r>
+              <w:rPr>
+                <w:sz w:val="17"/>
+              </w:rPr>
+              <w:t>fermentación</w:t>
+            </w:r>
+            <w:proofErr w:type="spellEnd"/>
+            <w:r>
+              <w:rPr>
+                <w:sz w:val="17"/>
+              </w:rPr>
+              <w:t xml:space="preserve">, </w:t>
+            </w:r>
+            <w:proofErr w:type="spellStart"/>
+            <w:r>
+              <w:rPr>
+                <w:sz w:val="17"/>
+              </w:rPr>
+              <w:t>secado</w:t>
+            </w:r>
+            <w:proofErr w:type="spellEnd"/>
+            <w:r>
+              <w:rPr>
+                <w:sz w:val="17"/>
+              </w:rPr>
+              <w:t xml:space="preserve">, inventario, </w:t>
+            </w:r>
+            <w:proofErr w:type="spellStart"/>
+            <w:r>
+              <w:rPr>
+                <w:sz w:val="17"/>
+              </w:rPr>
+              <w:t>vendido</w:t>
+            </w:r>
+            <w:proofErr w:type="spellEnd"/>
+            <w:r>
+              <w:rPr>
+                <w:sz w:val="17"/>
+              </w:rPr>
+              <w:t>.</w:t>
             </w:r>
           </w:p>
         </w:tc>
@@ -4012,7 +5719,77 @@
               <w:rPr>
                 <w:sz w:val="17"/>
               </w:rPr>
-              <w:t>Crear catálogo fijo de estados para evitar errores de escritura.</w:t>
+              <w:t xml:space="preserve">Crear </w:t>
+            </w:r>
+            <w:proofErr w:type="spellStart"/>
+            <w:r>
+              <w:rPr>
+                <w:sz w:val="17"/>
+              </w:rPr>
+              <w:t>catálogo</w:t>
+            </w:r>
+            <w:proofErr w:type="spellEnd"/>
+            <w:r>
+              <w:rPr>
+                <w:sz w:val="17"/>
+              </w:rPr>
+              <w:t xml:space="preserve"> </w:t>
+            </w:r>
+            <w:proofErr w:type="spellStart"/>
+            <w:r>
+              <w:rPr>
+                <w:sz w:val="17"/>
+              </w:rPr>
+              <w:t>fijo</w:t>
+            </w:r>
+            <w:proofErr w:type="spellEnd"/>
+            <w:r>
+              <w:rPr>
+                <w:sz w:val="17"/>
+              </w:rPr>
+              <w:t xml:space="preserve"> de </w:t>
+            </w:r>
+            <w:proofErr w:type="spellStart"/>
+            <w:r>
+              <w:rPr>
+                <w:sz w:val="17"/>
+              </w:rPr>
+              <w:t>estados</w:t>
+            </w:r>
+            <w:proofErr w:type="spellEnd"/>
+            <w:r>
+              <w:rPr>
+                <w:sz w:val="17"/>
+              </w:rPr>
+              <w:t xml:space="preserve"> para </w:t>
+            </w:r>
+            <w:proofErr w:type="spellStart"/>
+            <w:r>
+              <w:rPr>
+                <w:sz w:val="17"/>
+              </w:rPr>
+              <w:t>evitar</w:t>
+            </w:r>
+            <w:proofErr w:type="spellEnd"/>
+            <w:r>
+              <w:rPr>
+                <w:sz w:val="17"/>
+              </w:rPr>
+              <w:t xml:space="preserve"> errores de </w:t>
+            </w:r>
+            <w:proofErr w:type="spellStart"/>
+            <w:r>
+              <w:rPr>
+                <w:sz w:val="17"/>
+              </w:rPr>
+              <w:t>escritura</w:t>
+            </w:r>
+            <w:proofErr w:type="spellEnd"/>
+            <w:r>
+              <w:rPr>
+                <w:sz w:val="17"/>
+              </w:rPr>
+              <w:t>.</w:t>
             </w:r>
           </w:p>
         </w:tc>
@@ -4099,8 +5876,30 @@
               <w:rPr>
                 <w:sz w:val="17"/>
               </w:rPr>
-              <w:t>Valores incorrectos de humedad</w:t>
-            </w:r>
+              <w:t xml:space="preserve">Valores </w:t>
+            </w:r>
+            <w:proofErr w:type="spellStart"/>
+            <w:r>
+              <w:rPr>
+                <w:sz w:val="17"/>
+              </w:rPr>
+              <w:t>incorrectos</w:t>
+            </w:r>
+            <w:proofErr w:type="spellEnd"/>
+            <w:r>
+              <w:rPr>
+                <w:sz w:val="17"/>
+              </w:rPr>
+              <w:t xml:space="preserve"> de </w:t>
+            </w:r>
+            <w:proofErr w:type="spellStart"/>
+            <w:r>
+              <w:rPr>
+                <w:sz w:val="17"/>
+              </w:rPr>
+              <w:t>humedad</w:t>
+            </w:r>
+            <w:proofErr w:type="spellEnd"/>
           </w:p>
         </w:tc>
         <w:tc>
@@ -4112,7 +5911,35 @@
               <w:rPr>
                 <w:sz w:val="17"/>
               </w:rPr>
-              <w:t>Usar validaciones numéricas y mensajes de advertencia.</w:t>
+              <w:t xml:space="preserve">Usar validaciones </w:t>
+            </w:r>
+            <w:proofErr w:type="spellStart"/>
+            <w:r>
+              <w:rPr>
+                <w:sz w:val="17"/>
+              </w:rPr>
+              <w:t>numéricas</w:t>
+            </w:r>
+            <w:proofErr w:type="spellEnd"/>
+            <w:r>
+              <w:rPr>
+                <w:sz w:val="17"/>
+              </w:rPr>
+              <w:t xml:space="preserve"> y mensajes de </w:t>
+            </w:r>
+            <w:proofErr w:type="spellStart"/>
+            <w:r>
+              <w:rPr>
+                <w:sz w:val="17"/>
+              </w:rPr>
+              <w:t>advertencia</w:t>
+            </w:r>
+            <w:proofErr w:type="spellEnd"/>
+            <w:r>
+              <w:rPr>
+                <w:sz w:val="17"/>
+              </w:rPr>
+              <w:t>.</w:t>
             </w:r>
           </w:p>
         </w:tc>
@@ -4126,12 +5953,42 @@
             <w:tcW w:w="5184" w:type="dxa"/>
           </w:tcPr>
           <w:p>
+            <w:proofErr w:type="spellStart"/>
             <w:r>
               <w:rPr>
                 <w:sz w:val="17"/>
               </w:rPr>
-              <w:t>Estados escritos de forma distinta</w:t>
-            </w:r>
+              <w:t>Estados</w:t>
+            </w:r>
+            <w:proofErr w:type="spellEnd"/>
+            <w:r>
+              <w:rPr>
+                <w:sz w:val="17"/>
+              </w:rPr>
+              <w:t xml:space="preserve"> </w:t>
+            </w:r>
+            <w:proofErr w:type="spellStart"/>
+            <w:r>
+              <w:rPr>
+                <w:sz w:val="17"/>
+              </w:rPr>
+              <w:t>escritos</w:t>
+            </w:r>
+            <w:proofErr w:type="spellEnd"/>
+            <w:r>
+              <w:rPr>
+                <w:sz w:val="17"/>
+              </w:rPr>
+              <w:t xml:space="preserve"> de forma </w:t>
+            </w:r>
+            <w:proofErr w:type="spellStart"/>
+            <w:r>
+              <w:rPr>
+                <w:sz w:val="17"/>
+              </w:rPr>
+              <w:t>distinta</w:t>
+            </w:r>
+            <w:proofErr w:type="spellEnd"/>
           </w:p>
         </w:tc>
         <w:tc>
@@ -4143,7 +6000,63 @@
               <w:rPr>
                 <w:sz w:val="17"/>
               </w:rPr>
-              <w:t>Usar listas desplegables en lugar de campos abiertos.</w:t>
+              <w:t xml:space="preserve">Usar </w:t>
+            </w:r>
+            <w:proofErr w:type="spellStart"/>
+            <w:r>
+              <w:rPr>
+                <w:sz w:val="17"/>
+              </w:rPr>
+              <w:t>listas</w:t>
+            </w:r>
+            <w:proofErr w:type="spellEnd"/>
+            <w:r>
+              <w:rPr>
+                <w:sz w:val="17"/>
+              </w:rPr>
+              <w:t xml:space="preserve"> </w:t>
+            </w:r>
+            <w:proofErr w:type="spellStart"/>
+            <w:r>
+              <w:rPr>
+                <w:sz w:val="17"/>
+              </w:rPr>
+              <w:t>desplegables</w:t>
+            </w:r>
+            <w:proofErr w:type="spellEnd"/>
+            <w:r>
+              <w:rPr>
+                <w:sz w:val="17"/>
+              </w:rPr>
+              <w:t xml:space="preserve"> en </w:t>
+            </w:r>
+            <w:proofErr w:type="spellStart"/>
+            <w:r>
+              <w:rPr>
+                <w:sz w:val="17"/>
+              </w:rPr>
+              <w:t>lugar</w:t>
+            </w:r>
+            <w:proofErr w:type="spellEnd"/>
+            <w:r>
+              <w:rPr>
+                <w:sz w:val="17"/>
+              </w:rPr>
+              <w:t xml:space="preserve"> de campos </w:t>
+            </w:r>
+            <w:proofErr w:type="spellStart"/>
+            <w:r>
+              <w:rPr>
+                <w:sz w:val="17"/>
+              </w:rPr>
+              <w:t>abiertos</w:t>
+            </w:r>
+            <w:proofErr w:type="spellEnd"/>
+            <w:r>
+              <w:rPr>
+                <w:sz w:val="17"/>
+              </w:rPr>
+              <w:t>.</w:t>
             </w:r>
           </w:p>
         </w:tc>
@@ -4161,8 +6074,16 @@
               <w:rPr>
                 <w:sz w:val="17"/>
               </w:rPr>
-              <w:t>Consulta lenta o confusa</w:t>
-            </w:r>
+              <w:t xml:space="preserve">Consulta lenta o </w:t>
+            </w:r>
+            <w:proofErr w:type="spellStart"/>
+            <w:r>
+              <w:rPr>
+                <w:sz w:val="17"/>
+              </w:rPr>
+              <w:t>confusa</w:t>
+            </w:r>
+            <w:proofErr w:type="spellEnd"/>
           </w:p>
         </w:tc>
         <w:tc>
@@ -4174,7 +6095,35 @@
               <w:rPr>
                 <w:sz w:val="17"/>
               </w:rPr>
-              <w:t>Agregar búsqueda exacta por código y mensaje de lote no encontrado.</w:t>
+              <w:t xml:space="preserve">Agregar búsqueda exacta por código y </w:t>
+            </w:r>
+            <w:proofErr w:type="spellStart"/>
+            <w:r>
+              <w:rPr>
+                <w:sz w:val="17"/>
+              </w:rPr>
+              <w:t>mensaje</w:t>
+            </w:r>
+            <w:proofErr w:type="spellEnd"/>
+            <w:r>
+              <w:rPr>
+                <w:sz w:val="17"/>
+              </w:rPr>
+              <w:t xml:space="preserve"> de lote no </w:t>
+            </w:r>
+            <w:proofErr w:type="spellStart"/>
+            <w:r>
+              <w:rPr>
+                <w:sz w:val="17"/>
+              </w:rPr>
+              <w:t>encontrado</w:t>
+            </w:r>
+            <w:proofErr w:type="spellEnd"/>
+            <w:r>
+              <w:rPr>
+                <w:sz w:val="17"/>
+              </w:rPr>
+              <w:t>.</w:t>
             </w:r>
           </w:p>
         </w:tc>

</xml_diff>